<commit_message>
Fix Test Cases and add doc string/comments
</commit_message>
<xml_diff>
--- a/docs/2. Sorting.docx
+++ b/docs/2. Sorting.docx
@@ -210,7 +210,7 @@
           <w:r>
             <w:fldChar w:fldCharType="separate"/>
           </w:r>
-          <w:hyperlink w:anchor="_Toc227859884" w:history="1">
+          <w:hyperlink w:anchor="_Toc227880925" w:history="1">
             <w:r>
               <w:rPr>
                 <w:rStyle w:val="Hyperlink"/>
@@ -250,7 +250,7 @@
                 <w:noProof/>
                 <w:webHidden/>
               </w:rPr>
-              <w:instrText xml:space="preserve"> PAGEREF _Toc227859884 \h </w:instrText>
+              <w:instrText xml:space="preserve"> PAGEREF _Toc227880925 \h </w:instrText>
             </w:r>
             <w:r>
               <w:rPr>
@@ -292,7 +292,7 @@
               <w:noProof/>
             </w:rPr>
           </w:pPr>
-          <w:hyperlink w:anchor="_Toc227859885" w:history="1">
+          <w:hyperlink w:anchor="_Toc227880926" w:history="1">
             <w:r>
               <w:rPr>
                 <w:rStyle w:val="Hyperlink"/>
@@ -332,7 +332,7 @@
                 <w:noProof/>
                 <w:webHidden/>
               </w:rPr>
-              <w:instrText xml:space="preserve"> PAGEREF _Toc227859885 \h </w:instrText>
+              <w:instrText xml:space="preserve"> PAGEREF _Toc227880926 \h </w:instrText>
             </w:r>
             <w:r>
               <w:rPr>
@@ -374,7 +374,7 @@
               <w:noProof/>
             </w:rPr>
           </w:pPr>
-          <w:hyperlink w:anchor="_Toc227859886" w:history="1">
+          <w:hyperlink w:anchor="_Toc227880927" w:history="1">
             <w:r>
               <w:rPr>
                 <w:rStyle w:val="Hyperlink"/>
@@ -414,7 +414,7 @@
                 <w:noProof/>
                 <w:webHidden/>
               </w:rPr>
-              <w:instrText xml:space="preserve"> PAGEREF _Toc227859886 \h </w:instrText>
+              <w:instrText xml:space="preserve"> PAGEREF _Toc227880927 \h </w:instrText>
             </w:r>
             <w:r>
               <w:rPr>
@@ -456,7 +456,7 @@
               <w:noProof/>
             </w:rPr>
           </w:pPr>
-          <w:hyperlink w:anchor="_Toc227859887" w:history="1">
+          <w:hyperlink w:anchor="_Toc227880928" w:history="1">
             <w:r>
               <w:rPr>
                 <w:rStyle w:val="Hyperlink"/>
@@ -496,7 +496,7 @@
                 <w:noProof/>
                 <w:webHidden/>
               </w:rPr>
-              <w:instrText xml:space="preserve"> PAGEREF _Toc227859887 \h </w:instrText>
+              <w:instrText xml:space="preserve"> PAGEREF _Toc227880928 \h </w:instrText>
             </w:r>
             <w:r>
               <w:rPr>
@@ -538,7 +538,7 @@
               <w:noProof/>
             </w:rPr>
           </w:pPr>
-          <w:hyperlink w:anchor="_Toc227859888" w:history="1">
+          <w:hyperlink w:anchor="_Toc227880929" w:history="1">
             <w:r>
               <w:rPr>
                 <w:rStyle w:val="Hyperlink"/>
@@ -578,7 +578,7 @@
                 <w:noProof/>
                 <w:webHidden/>
               </w:rPr>
-              <w:instrText xml:space="preserve"> PAGEREF _Toc227859888 \h </w:instrText>
+              <w:instrText xml:space="preserve"> PAGEREF _Toc227880929 \h </w:instrText>
             </w:r>
             <w:r>
               <w:rPr>
@@ -620,7 +620,7 @@
               <w:noProof/>
             </w:rPr>
           </w:pPr>
-          <w:hyperlink w:anchor="_Toc227859889" w:history="1">
+          <w:hyperlink w:anchor="_Toc227880930" w:history="1">
             <w:r>
               <w:rPr>
                 <w:rStyle w:val="Hyperlink"/>
@@ -660,7 +660,7 @@
                 <w:noProof/>
                 <w:webHidden/>
               </w:rPr>
-              <w:instrText xml:space="preserve"> PAGEREF _Toc227859889 \h </w:instrText>
+              <w:instrText xml:space="preserve"> PAGEREF _Toc227880930 \h </w:instrText>
             </w:r>
             <w:r>
               <w:rPr>
@@ -702,7 +702,7 @@
               <w:noProof/>
             </w:rPr>
           </w:pPr>
-          <w:hyperlink w:anchor="_Toc227859890" w:history="1">
+          <w:hyperlink w:anchor="_Toc227880931" w:history="1">
             <w:r>
               <w:rPr>
                 <w:rStyle w:val="Hyperlink"/>
@@ -742,7 +742,7 @@
                 <w:noProof/>
                 <w:webHidden/>
               </w:rPr>
-              <w:instrText xml:space="preserve"> PAGEREF _Toc227859890 \h </w:instrText>
+              <w:instrText xml:space="preserve"> PAGEREF _Toc227880931 \h </w:instrText>
             </w:r>
             <w:r>
               <w:rPr>
@@ -762,7 +762,7 @@
                 <w:noProof/>
                 <w:webHidden/>
               </w:rPr>
-              <w:t>7</w:t>
+              <w:t>8</w:t>
             </w:r>
             <w:r>
               <w:rPr>
@@ -784,7 +784,7 @@
               <w:noProof/>
             </w:rPr>
           </w:pPr>
-          <w:hyperlink w:anchor="_Toc227859891" w:history="1">
+          <w:hyperlink w:anchor="_Toc227880932" w:history="1">
             <w:r>
               <w:rPr>
                 <w:rStyle w:val="Hyperlink"/>
@@ -824,7 +824,7 @@
                 <w:noProof/>
                 <w:webHidden/>
               </w:rPr>
-              <w:instrText xml:space="preserve"> PAGEREF _Toc227859891 \h </w:instrText>
+              <w:instrText xml:space="preserve"> PAGEREF _Toc227880932 \h </w:instrText>
             </w:r>
             <w:r>
               <w:rPr>
@@ -865,7 +865,7 @@
               <w:noProof/>
             </w:rPr>
           </w:pPr>
-          <w:hyperlink w:anchor="_Toc227859892" w:history="1">
+          <w:hyperlink w:anchor="_Toc227880933" w:history="1">
             <w:r>
               <w:rPr>
                 <w:rStyle w:val="Hyperlink"/>
@@ -892,7 +892,7 @@
                 <w:noProof/>
                 <w:webHidden/>
               </w:rPr>
-              <w:instrText xml:space="preserve"> PAGEREF _Toc227859892 \h </w:instrText>
+              <w:instrText xml:space="preserve"> PAGEREF _Toc227880933 \h </w:instrText>
             </w:r>
             <w:r>
               <w:rPr>
@@ -912,7 +912,7 @@
                 <w:noProof/>
                 <w:webHidden/>
               </w:rPr>
-              <w:t>9</w:t>
+              <w:t>10</w:t>
             </w:r>
             <w:r>
               <w:rPr>
@@ -975,7 +975,7 @@
           <w:numId w:val="8"/>
         </w:numPr>
       </w:pPr>
-      <w:bookmarkStart w:id="0" w:name="_Toc227859884"/>
+      <w:bookmarkStart w:id="0" w:name="_Toc227880925"/>
       <w:r>
         <w:lastRenderedPageBreak/>
         <w:t>Spark Sorting Strategies and Behavior</w:t>
@@ -1029,7 +1029,7 @@
           <w:numId w:val="8"/>
         </w:numPr>
       </w:pPr>
-      <w:bookmarkStart w:id="1" w:name="_Toc227859885"/>
+      <w:bookmarkStart w:id="1" w:name="_Toc227880926"/>
       <w:r>
         <w:t>Sort-Merge Join</w:t>
       </w:r>
@@ -1172,9 +1172,9 @@
           <w:noProof/>
         </w:rPr>
         <w:drawing>
-          <wp:inline distT="0" distB="0" distL="0" distR="0" wp14:anchorId="2E29260D" wp14:editId="69357A46">
-            <wp:extent cx="3765260" cy="1453081"/>
-            <wp:effectExtent l="0" t="0" r="6985" b="0"/>
+          <wp:inline distT="0" distB="0" distL="0" distR="0" wp14:anchorId="2E29260D" wp14:editId="60AF79DF">
+            <wp:extent cx="3764739" cy="2013284"/>
+            <wp:effectExtent l="0" t="0" r="7620" b="6350"/>
             <wp:docPr id="525809105" name="Picture 1" descr="Spark SQL Bucketing at Facebook - Cheng Su (Facebook)"/>
             <wp:cNvGraphicFramePr>
               <a:graphicFrameLocks xmlns:a="http://schemas.openxmlformats.org/drawingml/2006/main" noChangeAspect="1"/>
@@ -1204,7 +1204,7 @@
                   <pic:spPr bwMode="auto">
                     <a:xfrm>
                       <a:off x="0" y="0"/>
-                      <a:ext cx="3782344" cy="1459674"/>
+                      <a:ext cx="3787751" cy="2025590"/>
                     </a:xfrm>
                     <a:prstGeom prst="rect">
                       <a:avLst/>
@@ -1700,6 +1700,9 @@
         <w:gridCol w:w="4675"/>
       </w:tblGrid>
       <w:tr>
+        <w:trPr>
+          <w:tblHeader/>
+        </w:trPr>
         <w:tc>
           <w:tcPr>
             <w:tcW w:w="4675" w:type="dxa"/>
@@ -1845,7 +1848,6 @@
               <w:rPr>
                 <w:rFonts w:ascii="Times New Roman" w:hAnsi="Times New Roman" w:cs="Times New Roman"/>
               </w:rPr>
-              <w:lastRenderedPageBreak/>
               <w:t>Skew friendly with AQE</w:t>
             </w:r>
             <w:r>
@@ -2026,12 +2028,9 @@
           <w:numId w:val="8"/>
         </w:numPr>
       </w:pPr>
-      <w:bookmarkStart w:id="2" w:name="_Toc227859886"/>
-      <w:r>
-        <w:t>Broadcast Hash</w:t>
-      </w:r>
-      <w:r>
-        <w:t xml:space="preserve"> Join</w:t>
+      <w:bookmarkStart w:id="2" w:name="_Toc227880927"/>
+      <w:r>
+        <w:t>Broadcast Hash Join</w:t>
       </w:r>
       <w:r>
         <w:t xml:space="preserve"> (BHJ)</w:t>
@@ -2187,6 +2186,7 @@
           <w:bCs/>
           <w:noProof/>
         </w:rPr>
+        <w:lastRenderedPageBreak/>
         <mc:AlternateContent>
           <mc:Choice Requires="wps">
             <w:drawing>
@@ -3050,18 +3050,9 @@
           <w:numId w:val="8"/>
         </w:numPr>
       </w:pPr>
-      <w:bookmarkStart w:id="3" w:name="_Toc227859887"/>
-      <w:r>
-        <w:t>Shuffle</w:t>
-      </w:r>
-      <w:r>
-        <w:t xml:space="preserve"> Hash Join (</w:t>
-      </w:r>
-      <w:r>
-        <w:t>S</w:t>
-      </w:r>
-      <w:r>
-        <w:t>HJ)</w:t>
+      <w:bookmarkStart w:id="3" w:name="_Toc227880928"/>
+      <w:r>
+        <w:t>Shuffle Hash Join (SHJ)</w:t>
       </w:r>
       <w:bookmarkEnd w:id="3"/>
     </w:p>
@@ -3090,9 +3081,9 @@
           <w:noProof/>
         </w:rPr>
         <w:drawing>
-          <wp:inline distT="0" distB="0" distL="0" distR="0" wp14:anchorId="5CC4ED91" wp14:editId="2362CED9">
-            <wp:extent cx="4532132" cy="2124710"/>
-            <wp:effectExtent l="0" t="0" r="1905" b="8890"/>
+          <wp:inline distT="0" distB="0" distL="0" distR="0" wp14:anchorId="5CC4ED91" wp14:editId="7A5A8892">
+            <wp:extent cx="4531995" cy="2390274"/>
+            <wp:effectExtent l="0" t="0" r="1905" b="0"/>
             <wp:docPr id="810832176" name="Picture 3"/>
             <wp:cNvGraphicFramePr>
               <a:graphicFrameLocks xmlns:a="http://schemas.openxmlformats.org/drawingml/2006/main" noChangeAspect="1"/>
@@ -3122,7 +3113,7 @@
                   <pic:spPr bwMode="auto">
                     <a:xfrm>
                       <a:off x="0" y="0"/>
-                      <a:ext cx="4538693" cy="2127786"/>
+                      <a:ext cx="4542901" cy="2396026"/>
                     </a:xfrm>
                     <a:prstGeom prst="rect">
                       <a:avLst/>
@@ -3166,6 +3157,7 @@
           <w:bCs/>
           <w:noProof/>
         </w:rPr>
+        <w:lastRenderedPageBreak/>
         <mc:AlternateContent>
           <mc:Choice Requires="wps">
             <w:drawing>
@@ -3744,7 +3736,6 @@
                 <w:sz w:val="20"/>
                 <w:szCs w:val="20"/>
               </w:rPr>
-              <w:lastRenderedPageBreak/>
               <w:t xml:space="preserve">   </w:t>
             </w:r>
             <w:r>
@@ -3825,13 +3816,7 @@
               <w:rPr>
                 <w:rFonts w:ascii="Times New Roman" w:hAnsi="Times New Roman" w:cs="Times New Roman"/>
               </w:rPr>
-              <w:t xml:space="preserve"> – </w:t>
-            </w:r>
-            <w:r>
-              <w:rPr>
-                <w:rFonts w:ascii="Times New Roman" w:hAnsi="Times New Roman" w:cs="Times New Roman"/>
-              </w:rPr>
-              <w:t>faster than sort-merge join (SMJ) when partitions fit in memory.</w:t>
+              <w:t xml:space="preserve"> – faster than sort-merge join (SMJ) when partitions fit in memory.</w:t>
             </w:r>
           </w:p>
           <w:p>
@@ -3874,13 +3859,7 @@
               <w:rPr>
                 <w:rFonts w:ascii="Times New Roman" w:hAnsi="Times New Roman" w:cs="Times New Roman"/>
               </w:rPr>
-              <w:t xml:space="preserve">– </w:t>
-            </w:r>
-            <w:r>
-              <w:rPr>
-                <w:rFonts w:ascii="Times New Roman" w:hAnsi="Times New Roman" w:cs="Times New Roman"/>
-              </w:rPr>
-              <w:t>Hash lookups are faster than merge scans</w:t>
+              <w:t>– Hash lookups are faster than merge scans</w:t>
             </w:r>
           </w:p>
           <w:p>
@@ -3934,13 +3913,7 @@
               <w:rPr>
                 <w:rFonts w:ascii="Times New Roman" w:hAnsi="Times New Roman" w:cs="Times New Roman"/>
               </w:rPr>
-              <w:t xml:space="preserve"> – </w:t>
-            </w:r>
-            <w:r>
-              <w:rPr>
-                <w:rFonts w:ascii="Times New Roman" w:hAnsi="Times New Roman" w:cs="Times New Roman"/>
-              </w:rPr>
-              <w:t>network I/O and disk spill overhead</w:t>
+              <w:t xml:space="preserve"> – network I/O and disk spill overhead</w:t>
             </w:r>
           </w:p>
           <w:p>
@@ -3983,13 +3956,7 @@
               <w:rPr>
                 <w:rFonts w:ascii="Times New Roman" w:hAnsi="Times New Roman" w:cs="Times New Roman"/>
               </w:rPr>
-              <w:t xml:space="preserve">: </w:t>
-            </w:r>
-            <w:r>
-              <w:rPr>
-                <w:rFonts w:ascii="Times New Roman" w:hAnsi="Times New Roman" w:cs="Times New Roman"/>
-              </w:rPr>
-              <w:t>needs to build in-memory hash-table per partition running Out-of-Memory risks</w:t>
+              <w:t>: needs to build in-memory hash-table per partition running Out-of-Memory risks</w:t>
             </w:r>
           </w:p>
           <w:p>
@@ -4086,7 +4053,7 @@
           <w:numId w:val="8"/>
         </w:numPr>
       </w:pPr>
-      <w:bookmarkStart w:id="4" w:name="_Toc227859888"/>
+      <w:bookmarkStart w:id="4" w:name="_Toc227880929"/>
       <w:r>
         <w:t>Broadcast Nested Loop</w:t>
       </w:r>
@@ -4721,6 +4688,7 @@
                 <w:b/>
                 <w:bCs/>
               </w:rPr>
+              <w:lastRenderedPageBreak/>
               <w:t xml:space="preserve">Support </w:t>
             </w:r>
             <w:proofErr w:type="gramStart"/>
@@ -4745,13 +4713,7 @@
               <w:rPr>
                 <w:rFonts w:ascii="Times New Roman" w:hAnsi="Times New Roman" w:cs="Times New Roman"/>
               </w:rPr>
-              <w:t xml:space="preserve"> – </w:t>
-            </w:r>
-            <w:r>
-              <w:rPr>
-                <w:rFonts w:ascii="Times New Roman" w:hAnsi="Times New Roman" w:cs="Times New Roman"/>
-              </w:rPr>
-              <w:t>SMJ and SHJ requires equality (e.g. A.id = B.id) They cannot handle inequalities such as (</w:t>
+              <w:t xml:space="preserve"> – SMJ and SHJ requires equality (e.g. A.id = B.id) They cannot handle inequalities such as (</w:t>
             </w:r>
             <w:proofErr w:type="spellStart"/>
             <w:proofErr w:type="gramStart"/>
@@ -4905,13 +4867,7 @@
               <w:rPr>
                 <w:rFonts w:ascii="Times New Roman" w:hAnsi="Times New Roman" w:cs="Times New Roman"/>
               </w:rPr>
-              <w:t xml:space="preserve">– </w:t>
-            </w:r>
-            <w:r>
-              <w:rPr>
-                <w:rFonts w:ascii="Times New Roman" w:hAnsi="Times New Roman" w:cs="Times New Roman"/>
-              </w:rPr>
-              <w:t>Can cater for data is skewed, unsorted or missing keys since it checks every row.</w:t>
+              <w:t>– Can cater for data is skewed, unsorted or missing keys since it checks every row.</w:t>
             </w:r>
           </w:p>
         </w:tc>
@@ -4942,13 +4898,7 @@
               <w:rPr>
                 <w:rFonts w:ascii="Times New Roman" w:hAnsi="Times New Roman" w:cs="Times New Roman"/>
               </w:rPr>
-              <w:t xml:space="preserve"> – </w:t>
-            </w:r>
-            <w:r>
-              <w:rPr>
-                <w:rFonts w:ascii="Times New Roman" w:hAnsi="Times New Roman" w:cs="Times New Roman"/>
-              </w:rPr>
-              <w:t>Because the performance is O(</w:t>
+              <w:t xml:space="preserve"> – Because the performance is O(</w:t>
             </w:r>
             <w:proofErr w:type="spellStart"/>
             <w:r>
@@ -5067,9 +5017,8 @@
           <w:numId w:val="8"/>
         </w:numPr>
       </w:pPr>
-      <w:bookmarkStart w:id="5" w:name="_Toc227859889"/>
-      <w:r>
-        <w:lastRenderedPageBreak/>
+      <w:bookmarkStart w:id="5" w:name="_Toc227880930"/>
+      <w:r>
         <w:t>Cartesian Product Join</w:t>
       </w:r>
       <w:bookmarkEnd w:id="5"/>
@@ -5814,6 +5763,7 @@
           <w:b/>
           <w:bCs/>
         </w:rPr>
+        <w:lastRenderedPageBreak/>
         <w:t>Best for</w:t>
       </w:r>
       <w:r>
@@ -5859,7 +5809,7 @@
           <w:numId w:val="8"/>
         </w:numPr>
       </w:pPr>
-      <w:bookmarkStart w:id="6" w:name="_Toc227859890"/>
+      <w:bookmarkStart w:id="6" w:name="_Toc227880931"/>
       <w:r>
         <w:t>Comparison of Different Sorting Strategies</w:t>
       </w:r>
@@ -6200,9 +6150,8 @@
           <w:numId w:val="8"/>
         </w:numPr>
       </w:pPr>
-      <w:bookmarkStart w:id="7" w:name="_Toc227859891"/>
-      <w:r>
-        <w:lastRenderedPageBreak/>
+      <w:bookmarkStart w:id="7" w:name="_Toc227880932"/>
+      <w:r>
         <w:t>Recommended Strategy</w:t>
       </w:r>
       <w:bookmarkEnd w:id="7"/>
@@ -6740,6 +6689,7 @@
         <w:rPr>
           <w:rFonts w:ascii="Times New Roman" w:hAnsi="Times New Roman" w:cs="Times New Roman"/>
         </w:rPr>
+        <w:lastRenderedPageBreak/>
         <w:t xml:space="preserve">      </w:t>
       </w:r>
     </w:p>
@@ -6763,7 +6713,7 @@
       <w:pPr>
         <w:pStyle w:val="Heading2"/>
       </w:pPr>
-      <w:bookmarkStart w:id="8" w:name="_Toc227859892"/>
+      <w:bookmarkStart w:id="8" w:name="_Toc227880933"/>
       <w:r>
         <w:lastRenderedPageBreak/>
         <w:t>APPENDIX:  Adaptive Query Execution (AQE)</w:t>
@@ -6901,7 +6851,7 @@
       <w:r>
         <w:t xml:space="preserve">For more information on AQE, please refer to Spark documentation </w:t>
       </w:r>
-      <w:hyperlink r:id="rId11" w:history="1">
+      <w:hyperlink r:id="rId11" w:anchor="adaptive-query-execution" w:history="1">
         <w:r>
           <w:rPr>
             <w:rStyle w:val="Hyperlink"/>
@@ -6983,10 +6933,7 @@
         <w:footnoteRef/>
       </w:r>
       <w:r>
-        <w:t xml:space="preserve"> </w:t>
-      </w:r>
-      <w:r>
-        <w:t>In 2026, AQE may overrides this setting by convert SMJ to SHJ during runtime.</w:t>
+        <w:t xml:space="preserve"> In 2026, AQE may overrides this setting by convert SMJ to SHJ during runtime.</w:t>
       </w:r>
     </w:p>
   </w:footnote>
@@ -12653,6 +12600,7 @@
   <w:style w:type="character" w:default="1" w:styleId="DefaultParagraphFont">
     <w:name w:val="Default Paragraph Font"/>
     <w:uiPriority w:val="1"/>
+    <w:semiHidden/>
     <w:unhideWhenUsed/>
   </w:style>
   <w:style w:type="table" w:default="1" w:styleId="TableNormal">

</xml_diff>